<commit_message>
Heres The meeting log 2 with all other versions deleted. As well as some restructing of the project files.
</commit_message>
<xml_diff>
--- a/Meeting Logs/Meeting Log 1-11-26 through 1-18-26.docx
+++ b/Meeting Logs/Meeting Log 1-11-26 through 1-18-26.docx
@@ -15,7 +15,7 @@
         <w:tblLook w:val="04A0" w:firstRow="1" w:lastRow="0" w:firstColumn="1" w:lastColumn="0" w:noHBand="0" w:noVBand="1"/>
       </w:tblPr>
       <w:tblGrid>
-        <w:gridCol w:w="2929"/>
+        <w:gridCol w:w="2724"/>
         <w:gridCol w:w="81"/>
       </w:tblGrid>
       <w:tr>
@@ -161,21 +161,39 @@
                 <w:sz w:val="22"/>
                 <w:szCs w:val="22"/>
               </w:rPr>
-              <w:t>Team Lead</w:t>
+              <w:t xml:space="preserve">Team </w:t>
+            </w:r>
+            <w:proofErr w:type="gramStart"/>
+            <w:r>
+              <w:rPr>
+                <w:b/>
+                <w:bCs/>
+                <w:sz w:val="22"/>
+                <w:szCs w:val="22"/>
+              </w:rPr>
+              <w:t>Lead</w:t>
             </w:r>
             <w:r>
               <w:rPr>
                 <w:sz w:val="22"/>
                 <w:szCs w:val="22"/>
               </w:rPr>
-              <w:t xml:space="preserve">         </w:t>
+              <w:t xml:space="preserve">  </w:t>
             </w:r>
             <w:r>
               <w:rPr>
                 <w:sz w:val="22"/>
                 <w:szCs w:val="22"/>
               </w:rPr>
-              <w:t>Eric Parral</w:t>
+              <w:t>Eric</w:t>
+            </w:r>
+            <w:proofErr w:type="gramEnd"/>
+            <w:r>
+              <w:rPr>
+                <w:sz w:val="22"/>
+                <w:szCs w:val="22"/>
+              </w:rPr>
+              <w:t xml:space="preserve"> Parral</w:t>
             </w:r>
           </w:p>
           <w:p>
@@ -201,6 +219,14 @@
               </w:rPr>
               <w:t xml:space="preserve"> </w:t>
             </w:r>
+          </w:p>
+          <w:p>
+            <w:pPr>
+              <w:rPr>
+                <w:sz w:val="22"/>
+                <w:szCs w:val="22"/>
+              </w:rPr>
+            </w:pPr>
             <w:r>
               <w:rPr>
                 <w:sz w:val="22"/>
@@ -582,6 +608,13 @@
                 <w:szCs w:val="22"/>
               </w:rPr>
             </w:pPr>
+            <w:r>
+              <w:rPr>
+                <w:sz w:val="22"/>
+                <w:szCs w:val="22"/>
+              </w:rPr>
+              <w:t>1/17/26</w:t>
+            </w:r>
           </w:p>
         </w:tc>
         <w:tc>
@@ -595,6 +628,13 @@
                 <w:szCs w:val="22"/>
               </w:rPr>
             </w:pPr>
+            <w:r>
+              <w:rPr>
+                <w:sz w:val="22"/>
+                <w:szCs w:val="22"/>
+              </w:rPr>
+              <w:t>7:00</w:t>
+            </w:r>
           </w:p>
         </w:tc>
         <w:tc>
@@ -608,6 +648,13 @@
                 <w:szCs w:val="22"/>
               </w:rPr>
             </w:pPr>
+            <w:r>
+              <w:rPr>
+                <w:sz w:val="22"/>
+                <w:szCs w:val="22"/>
+              </w:rPr>
+              <w:t>All</w:t>
+            </w:r>
           </w:p>
         </w:tc>
       </w:tr>
@@ -631,16 +678,6 @@
           <w:szCs w:val="22"/>
         </w:rPr>
       </w:pPr>
-    </w:p>
-    <w:p>
-      <w:pPr>
-        <w:rPr>
-          <w:b/>
-          <w:bCs/>
-          <w:sz w:val="22"/>
-          <w:szCs w:val="22"/>
-        </w:rPr>
-      </w:pPr>
       <w:r>
         <w:rPr>
           <w:b/>
@@ -693,10 +730,19 @@
       </w:pPr>
       <w:r>
         <w:rPr>
-          <w:sz w:val="22"/>
-          <w:szCs w:val="22"/>
-        </w:rPr>
-        <w:t xml:space="preserve">Meeting 1: </w:t>
+          <w:b/>
+          <w:bCs/>
+          <w:sz w:val="22"/>
+          <w:szCs w:val="22"/>
+        </w:rPr>
+        <w:t>Meeting 1</w:t>
+      </w:r>
+      <w:r>
+        <w:rPr>
+          <w:sz w:val="22"/>
+          <w:szCs w:val="22"/>
+        </w:rPr>
+        <w:t xml:space="preserve">: </w:t>
       </w:r>
       <w:r>
         <w:rPr>
@@ -715,10 +761,66 @@
       </w:pPr>
       <w:r>
         <w:rPr>
-          <w:sz w:val="22"/>
-          <w:szCs w:val="22"/>
-        </w:rPr>
-        <w:t xml:space="preserve">Meeting 2: We started working on our project description within the group. We posted a rough draft to </w:t>
+          <w:b/>
+          <w:bCs/>
+          <w:sz w:val="22"/>
+          <w:szCs w:val="22"/>
+        </w:rPr>
+        <w:t>Meeting 2</w:t>
+      </w:r>
+      <w:r>
+        <w:rPr>
+          <w:sz w:val="22"/>
+          <w:szCs w:val="22"/>
+        </w:rPr>
+        <w:t xml:space="preserve">: We started working on our project description within the group. We posted a rough draft to </w:t>
+      </w:r>
+      <w:r>
+        <w:rPr>
+          <w:sz w:val="22"/>
+          <w:szCs w:val="22"/>
+        </w:rPr>
+        <w:t>GitHub</w:t>
+      </w:r>
+      <w:r>
+        <w:rPr>
+          <w:sz w:val="22"/>
+          <w:szCs w:val="22"/>
+        </w:rPr>
+        <w:t xml:space="preserve">. As well as talking to the project manager about our idea. </w:t>
+      </w:r>
+    </w:p>
+    <w:p>
+      <w:pPr>
+        <w:rPr>
+          <w:sz w:val="22"/>
+          <w:szCs w:val="22"/>
+        </w:rPr>
+      </w:pPr>
+      <w:r>
+        <w:rPr>
+          <w:b/>
+          <w:bCs/>
+          <w:sz w:val="22"/>
+          <w:szCs w:val="22"/>
+        </w:rPr>
+        <w:t>Meeting 3:</w:t>
+      </w:r>
+      <w:r>
+        <w:rPr>
+          <w:b/>
+          <w:bCs/>
+          <w:sz w:val="22"/>
+          <w:szCs w:val="22"/>
+        </w:rPr>
+        <w:t xml:space="preserve"> </w:t>
+      </w:r>
+      <w:r>
+        <w:rPr>
+          <w:sz w:val="22"/>
+          <w:szCs w:val="22"/>
+        </w:rPr>
+        <w:t xml:space="preserve">We are all still working on our project description and </w:t>
       </w:r>
       <w:proofErr w:type="gramStart"/>
       <w:r>
@@ -726,7 +828,7 @@
           <w:sz w:val="22"/>
           <w:szCs w:val="22"/>
         </w:rPr>
-        <w:t>the GitHub</w:t>
+        <w:t>decided</w:t>
       </w:r>
       <w:proofErr w:type="gramEnd"/>
       <w:r>
@@ -734,22 +836,7 @@
           <w:sz w:val="22"/>
           <w:szCs w:val="22"/>
         </w:rPr>
-        <w:t xml:space="preserve">. As well as talking to the project manager about our idea. </w:t>
-      </w:r>
-    </w:p>
-    <w:p>
-      <w:pPr>
-        <w:rPr>
-          <w:sz w:val="22"/>
-          <w:szCs w:val="22"/>
-        </w:rPr>
-      </w:pPr>
-      <w:r>
-        <w:rPr>
-          <w:sz w:val="22"/>
-          <w:szCs w:val="22"/>
-        </w:rPr>
-        <w:t>Meeting 3:</w:t>
+        <w:t xml:space="preserve"> to extend the due date till next week </w:t>
       </w:r>
     </w:p>
     <w:p>
@@ -794,10 +881,19 @@
       </w:pPr>
       <w:r>
         <w:rPr>
-          <w:sz w:val="22"/>
-          <w:szCs w:val="22"/>
-        </w:rPr>
-        <w:t xml:space="preserve">Meeting 1: </w:t>
+          <w:b/>
+          <w:bCs/>
+          <w:sz w:val="22"/>
+          <w:szCs w:val="22"/>
+        </w:rPr>
+        <w:t>Meeting 1</w:t>
+      </w:r>
+      <w:r>
+        <w:rPr>
+          <w:sz w:val="22"/>
+          <w:szCs w:val="22"/>
+        </w:rPr>
+        <w:t xml:space="preserve">: </w:t>
       </w:r>
       <w:r>
         <w:rPr>
@@ -846,25 +942,50 @@
       </w:pPr>
       <w:r>
         <w:rPr>
-          <w:sz w:val="22"/>
-          <w:szCs w:val="22"/>
-        </w:rPr>
-        <w:t xml:space="preserve">Meeting 2: Figuring out the complexity that we want to make the project come out to be. </w:t>
-      </w:r>
-    </w:p>
-    <w:p>
-      <w:pPr>
-        <w:rPr>
-          <w:sz w:val="22"/>
-          <w:szCs w:val="22"/>
-        </w:rPr>
-      </w:pPr>
-      <w:r>
-        <w:rPr>
-          <w:sz w:val="22"/>
-          <w:szCs w:val="22"/>
-        </w:rPr>
-        <w:t>Meeting 3:</w:t>
+          <w:b/>
+          <w:bCs/>
+          <w:sz w:val="22"/>
+          <w:szCs w:val="22"/>
+        </w:rPr>
+        <w:t>Meeting 2</w:t>
+      </w:r>
+      <w:r>
+        <w:rPr>
+          <w:sz w:val="22"/>
+          <w:szCs w:val="22"/>
+        </w:rPr>
+        <w:t xml:space="preserve">: Figuring out the complexity that we want to make the project come out to be. </w:t>
+      </w:r>
+    </w:p>
+    <w:p>
+      <w:pPr>
+        <w:rPr>
+          <w:sz w:val="22"/>
+          <w:szCs w:val="22"/>
+        </w:rPr>
+      </w:pPr>
+      <w:r>
+        <w:rPr>
+          <w:b/>
+          <w:bCs/>
+          <w:sz w:val="22"/>
+          <w:szCs w:val="22"/>
+        </w:rPr>
+        <w:t>Meeting 3</w:t>
+      </w:r>
+      <w:r>
+        <w:rPr>
+          <w:sz w:val="22"/>
+          <w:szCs w:val="22"/>
+        </w:rPr>
+        <w:t>:</w:t>
+      </w:r>
+      <w:r>
+        <w:rPr>
+          <w:sz w:val="22"/>
+          <w:szCs w:val="22"/>
+        </w:rPr>
+        <w:t xml:space="preserve"> We are having trouble condensing the different parts of the project description so we will need to work on that or accept that it will be long. </w:t>
       </w:r>
     </w:p>
     <w:p>
@@ -909,33 +1030,33 @@
       </w:pPr>
       <w:r>
         <w:rPr>
-          <w:sz w:val="22"/>
-          <w:szCs w:val="22"/>
-        </w:rPr>
-        <w:t xml:space="preserve">Meeting </w:t>
-      </w:r>
-      <w:proofErr w:type="gramStart"/>
-      <w:r>
-        <w:rPr>
-          <w:sz w:val="22"/>
-          <w:szCs w:val="22"/>
-        </w:rPr>
-        <w:t>1:</w:t>
-      </w:r>
-      <w:r>
-        <w:rPr>
-          <w:sz w:val="22"/>
-          <w:szCs w:val="22"/>
-        </w:rPr>
-        <w:t>Set</w:t>
-      </w:r>
-      <w:proofErr w:type="gramEnd"/>
-      <w:r>
-        <w:rPr>
-          <w:sz w:val="22"/>
-          <w:szCs w:val="22"/>
-        </w:rPr>
-        <w:t xml:space="preserve"> up </w:t>
+          <w:b/>
+          <w:bCs/>
+          <w:sz w:val="22"/>
+          <w:szCs w:val="22"/>
+        </w:rPr>
+        <w:t>Meeting 1</w:t>
+      </w:r>
+      <w:r>
+        <w:rPr>
+          <w:sz w:val="22"/>
+          <w:szCs w:val="22"/>
+        </w:rPr>
+        <w:t>:</w:t>
+      </w:r>
+      <w:r>
+        <w:rPr>
+          <w:sz w:val="22"/>
+          <w:szCs w:val="22"/>
+        </w:rPr>
+        <w:t xml:space="preserve"> </w:t>
+      </w:r>
+      <w:r>
+        <w:rPr>
+          <w:sz w:val="22"/>
+          <w:szCs w:val="22"/>
+        </w:rPr>
+        <w:t xml:space="preserve">Set up </w:t>
       </w:r>
       <w:proofErr w:type="spellStart"/>
       <w:r>
@@ -994,10 +1115,20 @@
       </w:pPr>
       <w:r>
         <w:rPr>
-          <w:sz w:val="22"/>
-          <w:szCs w:val="22"/>
-        </w:rPr>
-        <w:t>Meeting 2:</w:t>
+          <w:b/>
+          <w:bCs/>
+          <w:sz w:val="22"/>
+          <w:szCs w:val="22"/>
+        </w:rPr>
+        <w:lastRenderedPageBreak/>
+        <w:t>Meeting 2</w:t>
+      </w:r>
+      <w:r>
+        <w:rPr>
+          <w:sz w:val="22"/>
+          <w:szCs w:val="22"/>
+        </w:rPr>
+        <w:t>:</w:t>
       </w:r>
       <w:r>
         <w:rPr>
@@ -1014,14 +1145,22 @@
           <w:szCs w:val="22"/>
         </w:rPr>
       </w:pPr>
-    </w:p>
-    <w:p>
-      <w:pPr>
-        <w:rPr>
-          <w:sz w:val="22"/>
-          <w:szCs w:val="22"/>
-        </w:rPr>
-      </w:pPr>
+      <w:r>
+        <w:rPr>
+          <w:b/>
+          <w:bCs/>
+          <w:sz w:val="22"/>
+          <w:szCs w:val="22"/>
+        </w:rPr>
+        <w:t>Meeting 3</w:t>
+      </w:r>
+      <w:r>
+        <w:rPr>
+          <w:sz w:val="22"/>
+          <w:szCs w:val="22"/>
+        </w:rPr>
+        <w:t xml:space="preserve">: Finish up the final draft of the Project Description since we went through iteration 1 so we want to go and finalize it. </w:t>
+      </w:r>
     </w:p>
     <w:p>
       <w:pPr>
@@ -1086,14 +1225,32 @@
           <w:sz w:val="22"/>
           <w:szCs w:val="22"/>
         </w:rPr>
-        <w:t>1: Brainstorming</w:t>
-      </w:r>
-      <w:r>
-        <w:rPr>
-          <w:sz w:val="22"/>
-          <w:szCs w:val="22"/>
-        </w:rPr>
-        <w:t xml:space="preserve"> Idea </w:t>
+        <w:t xml:space="preserve">1: </w:t>
+      </w:r>
+      <w:r>
+        <w:rPr>
+          <w:b/>
+          <w:bCs/>
+          <w:sz w:val="22"/>
+          <w:szCs w:val="22"/>
+        </w:rPr>
+        <w:t>Brainstorming</w:t>
+      </w:r>
+      <w:r>
+        <w:rPr>
+          <w:b/>
+          <w:bCs/>
+          <w:sz w:val="22"/>
+          <w:szCs w:val="22"/>
+        </w:rPr>
+        <w:t xml:space="preserve"> Idea</w:t>
+      </w:r>
+      <w:r>
+        <w:rPr>
+          <w:sz w:val="22"/>
+          <w:szCs w:val="22"/>
+        </w:rPr>
+        <w:t xml:space="preserve"> </w:t>
       </w:r>
     </w:p>
     <w:p>
@@ -1160,22 +1317,31 @@
           <w:sz w:val="22"/>
           <w:szCs w:val="22"/>
         </w:rPr>
-        <w:t xml:space="preserve"> Make bullet points for your ideas on the Project Description</w:t>
-      </w:r>
-    </w:p>
-    <w:p>
-      <w:pPr>
-        <w:rPr>
-          <w:sz w:val="22"/>
-          <w:szCs w:val="22"/>
-        </w:rPr>
-      </w:pPr>
-      <w:r>
-        <w:rPr>
-          <w:sz w:val="22"/>
-          <w:szCs w:val="22"/>
-        </w:rPr>
-        <w:t xml:space="preserve">Which includes tech stack, description, API research, potential features, front end research (google maps API thing), Stake Holders (goals), Product Justification (explain the reason why </w:t>
+        <w:t xml:space="preserve"> </w:t>
+      </w:r>
+      <w:r>
+        <w:rPr>
+          <w:b/>
+          <w:bCs/>
+          <w:sz w:val="22"/>
+          <w:szCs w:val="22"/>
+        </w:rPr>
+        <w:t>Make bullet points for your ideas on the Project Description</w:t>
+      </w:r>
+    </w:p>
+    <w:p>
+      <w:pPr>
+        <w:rPr>
+          <w:sz w:val="22"/>
+          <w:szCs w:val="22"/>
+        </w:rPr>
+      </w:pPr>
+      <w:r>
+        <w:rPr>
+          <w:sz w:val="22"/>
+          <w:szCs w:val="22"/>
+        </w:rPr>
+        <w:t>Which includes tech stack, description, API research, potential features, front end research (google maps API thing), Stake Holders (goals), Product Justification (</w:t>
       </w:r>
       <w:proofErr w:type="gramStart"/>
       <w:r>
@@ -1183,7 +1349,7 @@
           <w:sz w:val="22"/>
           <w:szCs w:val="22"/>
         </w:rPr>
-        <w:t>its</w:t>
+        <w:t>explain</w:t>
       </w:r>
       <w:proofErr w:type="gramEnd"/>
       <w:r>
@@ -1191,7 +1357,48 @@
           <w:sz w:val="22"/>
           <w:szCs w:val="22"/>
         </w:rPr>
-        <w:t xml:space="preserve"> necessary) and Metrics for measuring success</w:t>
+        <w:t xml:space="preserve"> the reason why its necessary) and Metrics for measuring success</w:t>
+      </w:r>
+    </w:p>
+    <w:p>
+      <w:pPr>
+        <w:rPr>
+          <w:b/>
+          <w:bCs/>
+          <w:sz w:val="22"/>
+          <w:szCs w:val="22"/>
+        </w:rPr>
+      </w:pPr>
+      <w:r>
+        <w:rPr>
+          <w:sz w:val="22"/>
+          <w:szCs w:val="22"/>
+        </w:rPr>
+        <w:t xml:space="preserve">Meeting 3:  </w:t>
+      </w:r>
+      <w:r>
+        <w:rPr>
+          <w:b/>
+          <w:bCs/>
+          <w:sz w:val="22"/>
+          <w:szCs w:val="22"/>
+        </w:rPr>
+        <w:t xml:space="preserve">Discuss How we can create a final project description to later be translated into our SRS. </w:t>
+      </w:r>
+    </w:p>
+    <w:p>
+      <w:pPr>
+        <w:rPr>
+          <w:sz w:val="22"/>
+          <w:szCs w:val="22"/>
+        </w:rPr>
+      </w:pPr>
+      <w:r>
+        <w:rPr>
+          <w:sz w:val="22"/>
+          <w:szCs w:val="22"/>
+        </w:rPr>
+        <w:t xml:space="preserve">What functions do we have to implement. What another Research do we have to do? Maybe expand based off what the professor mentioned Wednesday. </w:t>
       </w:r>
     </w:p>
     <w:p>
@@ -1216,16 +1423,12 @@
     <w:p>
       <w:pPr>
         <w:rPr>
-          <w:b/>
-          <w:bCs/>
-          <w:sz w:val="22"/>
-          <w:szCs w:val="22"/>
-        </w:rPr>
-      </w:pPr>
-      <w:r>
-        <w:rPr>
-          <w:b/>
-          <w:bCs/>
+          <w:sz w:val="22"/>
+          <w:szCs w:val="22"/>
+        </w:rPr>
+      </w:pPr>
+      <w:r>
+        <w:rPr>
           <w:sz w:val="22"/>
           <w:szCs w:val="22"/>
         </w:rPr>
@@ -1233,24 +1436,64 @@
       </w:r>
       <w:r>
         <w:rPr>
-          <w:b/>
-          <w:bCs/>
-          <w:sz w:val="22"/>
-          <w:szCs w:val="22"/>
-        </w:rPr>
-        <w:t xml:space="preserve"> (</w:t>
-      </w:r>
-      <w:r>
-        <w:rPr>
-          <w:sz w:val="22"/>
-          <w:szCs w:val="22"/>
-        </w:rPr>
-        <w:t>Description &amp; Product Justification</w:t>
-      </w:r>
-      <w:r>
-        <w:rPr>
-          <w:b/>
-          <w:bCs/>
+          <w:sz w:val="22"/>
+          <w:szCs w:val="22"/>
+        </w:rPr>
+        <w:t xml:space="preserve"> (Description &amp; Product Justification)</w:t>
+      </w:r>
+    </w:p>
+    <w:p>
+      <w:pPr>
+        <w:rPr>
+          <w:sz w:val="22"/>
+          <w:szCs w:val="22"/>
+        </w:rPr>
+      </w:pPr>
+      <w:r>
+        <w:rPr>
+          <w:sz w:val="22"/>
+          <w:szCs w:val="22"/>
+        </w:rPr>
+        <w:t>Kyler – Work on Project Description Due Saturday</w:t>
+      </w:r>
+      <w:r>
+        <w:rPr>
+          <w:sz w:val="22"/>
+          <w:szCs w:val="22"/>
+        </w:rPr>
+        <w:t xml:space="preserve"> (Api Research &amp; Google Maps API) </w:t>
+      </w:r>
+    </w:p>
+    <w:p>
+      <w:pPr>
+        <w:rPr>
+          <w:sz w:val="22"/>
+          <w:szCs w:val="22"/>
+        </w:rPr>
+      </w:pPr>
+      <w:r>
+        <w:rPr>
+          <w:sz w:val="22"/>
+          <w:szCs w:val="22"/>
+        </w:rPr>
+        <w:t>Thomas– Work on Project Description Due Saturday</w:t>
+      </w:r>
+      <w:r>
+        <w:rPr>
+          <w:sz w:val="22"/>
+          <w:szCs w:val="22"/>
+        </w:rPr>
+        <w:t xml:space="preserve"> (Potential Features &amp; </w:t>
+      </w:r>
+      <w:r>
+        <w:rPr>
+          <w:sz w:val="22"/>
+          <w:szCs w:val="22"/>
+        </w:rPr>
+        <w:t>Stakeholders</w:t>
+      </w:r>
+      <w:r>
+        <w:rPr>
           <w:sz w:val="22"/>
           <w:szCs w:val="22"/>
         </w:rPr>
@@ -1266,202 +1509,17 @@
       </w:pPr>
       <w:r>
         <w:rPr>
-          <w:b/>
-          <w:bCs/>
-          <w:sz w:val="22"/>
-          <w:szCs w:val="22"/>
-        </w:rPr>
-        <w:t xml:space="preserve">Kyler </w:t>
-      </w:r>
-      <w:r>
-        <w:rPr>
-          <w:b/>
-          <w:bCs/>
-          <w:sz w:val="22"/>
-          <w:szCs w:val="22"/>
-        </w:rPr>
-        <w:t>– Work on Project Description</w:t>
-      </w:r>
-      <w:r>
-        <w:rPr>
-          <w:b/>
-          <w:bCs/>
-          <w:sz w:val="22"/>
-          <w:szCs w:val="22"/>
-        </w:rPr>
-        <w:t xml:space="preserve"> </w:t>
-      </w:r>
-      <w:r>
-        <w:rPr>
-          <w:b/>
-          <w:bCs/>
-          <w:sz w:val="22"/>
-          <w:szCs w:val="22"/>
-        </w:rPr>
-        <w:t>Due Saturday</w:t>
-      </w:r>
-      <w:r>
-        <w:rPr>
-          <w:b/>
-          <w:bCs/>
-          <w:sz w:val="22"/>
-          <w:szCs w:val="22"/>
-        </w:rPr>
-        <w:t xml:space="preserve"> (</w:t>
-      </w:r>
-      <w:r>
-        <w:rPr>
-          <w:sz w:val="22"/>
-          <w:szCs w:val="22"/>
-        </w:rPr>
-        <w:t xml:space="preserve">Api Research &amp; Google Maps API) </w:t>
-      </w:r>
-    </w:p>
-    <w:p>
-      <w:pPr>
-        <w:rPr>
-          <w:b/>
-          <w:bCs/>
-          <w:sz w:val="22"/>
-          <w:szCs w:val="22"/>
-        </w:rPr>
-      </w:pPr>
-      <w:r>
-        <w:rPr>
-          <w:b/>
-          <w:bCs/>
-          <w:sz w:val="22"/>
-          <w:szCs w:val="22"/>
-        </w:rPr>
-        <w:t>Thomas</w:t>
-      </w:r>
-      <w:r>
-        <w:rPr>
-          <w:b/>
-          <w:bCs/>
-          <w:sz w:val="22"/>
-          <w:szCs w:val="22"/>
-        </w:rPr>
-        <w:t>– Work on Project Description</w:t>
-      </w:r>
-      <w:r>
-        <w:rPr>
-          <w:b/>
-          <w:bCs/>
-          <w:sz w:val="22"/>
-          <w:szCs w:val="22"/>
-        </w:rPr>
-        <w:t xml:space="preserve"> </w:t>
-      </w:r>
-      <w:r>
-        <w:rPr>
-          <w:b/>
-          <w:bCs/>
-          <w:sz w:val="22"/>
-          <w:szCs w:val="22"/>
-        </w:rPr>
-        <w:t>Due Saturday</w:t>
-      </w:r>
-      <w:r>
-        <w:rPr>
-          <w:b/>
-          <w:bCs/>
-          <w:sz w:val="22"/>
-          <w:szCs w:val="22"/>
-        </w:rPr>
-        <w:t xml:space="preserve"> </w:t>
-      </w:r>
-      <w:r>
-        <w:rPr>
-          <w:sz w:val="22"/>
-          <w:szCs w:val="22"/>
-        </w:rPr>
-        <w:t xml:space="preserve">(Potential Features &amp; </w:t>
-      </w:r>
-      <w:r>
-        <w:rPr>
-          <w:sz w:val="22"/>
-          <w:szCs w:val="22"/>
-        </w:rPr>
-        <w:t>Stakeholders</w:t>
-      </w:r>
-      <w:r>
-        <w:rPr>
-          <w:b/>
-          <w:bCs/>
-          <w:sz w:val="22"/>
-          <w:szCs w:val="22"/>
-        </w:rPr>
-        <w:t>)</w:t>
-      </w:r>
-    </w:p>
-    <w:p>
-      <w:pPr>
-        <w:rPr>
-          <w:sz w:val="22"/>
-          <w:szCs w:val="22"/>
-        </w:rPr>
-      </w:pPr>
-      <w:r>
-        <w:rPr>
-          <w:b/>
-          <w:bCs/>
-          <w:sz w:val="22"/>
-          <w:szCs w:val="22"/>
-        </w:rPr>
-        <w:t>Eric</w:t>
-      </w:r>
-      <w:r>
-        <w:rPr>
-          <w:b/>
-          <w:bCs/>
-          <w:sz w:val="22"/>
-          <w:szCs w:val="22"/>
-        </w:rPr>
-        <w:t>– Work on Project Description</w:t>
-      </w:r>
-      <w:r>
-        <w:rPr>
-          <w:b/>
-          <w:bCs/>
-          <w:sz w:val="22"/>
-          <w:szCs w:val="22"/>
-        </w:rPr>
-        <w:t xml:space="preserve"> </w:t>
-      </w:r>
-      <w:r>
-        <w:rPr>
-          <w:b/>
-          <w:bCs/>
-          <w:sz w:val="22"/>
-          <w:szCs w:val="22"/>
-        </w:rPr>
-        <w:t>Due Saturday</w:t>
-      </w:r>
-      <w:r>
-        <w:rPr>
-          <w:b/>
-          <w:bCs/>
-          <w:sz w:val="22"/>
-          <w:szCs w:val="22"/>
-        </w:rPr>
-        <w:t xml:space="preserve"> (</w:t>
-      </w:r>
-      <w:r>
-        <w:rPr>
-          <w:sz w:val="22"/>
-          <w:szCs w:val="22"/>
-        </w:rPr>
-        <w:t>Tech Stack</w:t>
-      </w:r>
-      <w:r>
-        <w:rPr>
-          <w:b/>
-          <w:bCs/>
-          <w:sz w:val="22"/>
-          <w:szCs w:val="22"/>
-        </w:rPr>
-        <w:t xml:space="preserve"> </w:t>
+          <w:sz w:val="22"/>
+          <w:szCs w:val="22"/>
+        </w:rPr>
+        <w:t>Eric– Work on Project Description Due Saturday</w:t>
+      </w:r>
+      <w:r>
+        <w:rPr>
+          <w:sz w:val="22"/>
+          <w:szCs w:val="22"/>
+        </w:rPr>
+        <w:t xml:space="preserve"> (Tech Stack </w:t>
       </w:r>
       <w:r>
         <w:rPr>
@@ -1470,16 +1528,6 @@
         </w:rPr>
         <w:t xml:space="preserve">&amp; Metrics for Measuring Success) </w:t>
       </w:r>
-    </w:p>
-    <w:p>
-      <w:pPr>
-        <w:rPr>
-          <w:b/>
-          <w:bCs/>
-          <w:sz w:val="22"/>
-          <w:szCs w:val="22"/>
-        </w:rPr>
-      </w:pPr>
     </w:p>
     <w:p>
       <w:pPr>
@@ -1509,15 +1557,13 @@
         </w:rPr>
         <w:t xml:space="preserve">Since this is a small project, you may not have formal ownership roles. Instead, list the team </w:t>
       </w:r>
-      <w:proofErr w:type="gramStart"/>
       <w:r>
         <w:rPr>
           <w:sz w:val="16"/>
           <w:szCs w:val="16"/>
         </w:rPr>
-        <w:t>member</w:t>
-      </w:r>
-      <w:proofErr w:type="gramEnd"/>
+        <w:t>members</w:t>
+      </w:r>
       <w:r>
         <w:rPr>
           <w:sz w:val="16"/>
@@ -1637,6 +1683,54 @@
           <w:szCs w:val="22"/>
         </w:rPr>
       </w:pPr>
+      <w:r>
+        <w:rPr>
+          <w:b/>
+          <w:bCs/>
+          <w:sz w:val="22"/>
+          <w:szCs w:val="22"/>
+        </w:rPr>
+        <w:t>January 20</w:t>
+      </w:r>
+      <w:r>
+        <w:rPr>
+          <w:b/>
+          <w:bCs/>
+          <w:sz w:val="22"/>
+          <w:szCs w:val="22"/>
+          <w:vertAlign w:val="superscript"/>
+        </w:rPr>
+        <w:t>th</w:t>
+      </w:r>
+      <w:r>
+        <w:rPr>
+          <w:b/>
+          <w:bCs/>
+          <w:sz w:val="22"/>
+          <w:szCs w:val="22"/>
+        </w:rPr>
+        <w:t xml:space="preserve"> we will have </w:t>
+      </w:r>
+      <w:proofErr w:type="gramStart"/>
+      <w:r>
+        <w:rPr>
+          <w:b/>
+          <w:bCs/>
+          <w:sz w:val="22"/>
+          <w:szCs w:val="22"/>
+        </w:rPr>
+        <w:t>the</w:t>
+      </w:r>
+      <w:proofErr w:type="gramEnd"/>
+      <w:r>
+        <w:rPr>
+          <w:b/>
+          <w:bCs/>
+          <w:sz w:val="22"/>
+          <w:szCs w:val="22"/>
+        </w:rPr>
+        <w:t xml:space="preserve"> meeting to finalize the group project description and then work on SRS.</w:t>
+      </w:r>
     </w:p>
     <w:p>
       <w:pPr>
@@ -1682,7 +1776,14 @@
           <w:sz w:val="22"/>
           <w:szCs w:val="22"/>
         </w:rPr>
-        <w:t xml:space="preserve"> __________________________</w:t>
+        <w:t xml:space="preserve"> </w:t>
+      </w:r>
+      <w:r>
+        <w:rPr>
+          <w:sz w:val="22"/>
+          <w:szCs w:val="22"/>
+        </w:rPr>
+        <w:t>1/20/26</w:t>
       </w:r>
     </w:p>
     <w:p>
@@ -1703,6 +1804,7 @@
           <w:sz w:val="22"/>
           <w:szCs w:val="22"/>
         </w:rPr>
+        <w:lastRenderedPageBreak/>
         <w:t>Next Scheduled Time:</w:t>
       </w:r>
       <w:r>
@@ -1710,7 +1812,7 @@
           <w:sz w:val="22"/>
           <w:szCs w:val="22"/>
         </w:rPr>
-        <w:t xml:space="preserve"> __________________________</w:t>
+        <w:t xml:space="preserve"> 7:00 P.M </w:t>
       </w:r>
     </w:p>
     <w:p>
@@ -1758,7 +1860,6 @@
           <w:sz w:val="22"/>
           <w:szCs w:val="22"/>
         </w:rPr>
-        <w:lastRenderedPageBreak/>
         <w:t>Team Lead Name:</w:t>
       </w:r>
       <w:r>
@@ -1766,7 +1867,14 @@
           <w:sz w:val="22"/>
           <w:szCs w:val="22"/>
         </w:rPr>
-        <w:t xml:space="preserve"> __________________________</w:t>
+        <w:t xml:space="preserve"> </w:t>
+      </w:r>
+      <w:r>
+        <w:rPr>
+          <w:sz w:val="22"/>
+          <w:szCs w:val="22"/>
+        </w:rPr>
+        <w:t xml:space="preserve">Eric Parral </w:t>
       </w:r>
     </w:p>
     <w:p>
@@ -1787,32 +1895,14 @@
           <w:sz w:val="22"/>
           <w:szCs w:val="22"/>
         </w:rPr>
-        <w:t>Signature (if required</w:t>
-      </w:r>
-      <w:proofErr w:type="gramStart"/>
-      <w:r>
-        <w:rPr>
-          <w:b/>
-          <w:bCs/>
-          <w:sz w:val="22"/>
-          <w:szCs w:val="22"/>
-        </w:rPr>
-        <w:t>):</w:t>
-      </w:r>
-      <w:r>
-        <w:rPr>
-          <w:sz w:val="22"/>
-          <w:szCs w:val="22"/>
-        </w:rPr>
-        <w:t xml:space="preserve"> _</w:t>
-      </w:r>
-      <w:proofErr w:type="gramEnd"/>
-      <w:r>
-        <w:rPr>
-          <w:sz w:val="22"/>
-          <w:szCs w:val="22"/>
-        </w:rPr>
-        <w:t>___________________</w:t>
+        <w:t>Signature (if required):</w:t>
+      </w:r>
+      <w:r>
+        <w:rPr>
+          <w:sz w:val="22"/>
+          <w:szCs w:val="22"/>
+        </w:rPr>
+        <w:t xml:space="preserve"> Eric M. Parral</w:t>
       </w:r>
     </w:p>
     <w:p>
@@ -1840,7 +1930,7 @@
           <w:sz w:val="22"/>
           <w:szCs w:val="22"/>
         </w:rPr>
-        <w:t xml:space="preserve"> __________________________</w:t>
+        <w:t xml:space="preserve"> 1/18/26</w:t>
       </w:r>
     </w:p>
     <w:p>

</xml_diff>